<commit_message>
release: prepare v0.3.53 runtime
</commit_message>
<xml_diff>
--- a/assets/documents/henry-perkins-wordpress-support-engineer-resume.docx
+++ b/assets/documents/henry-perkins-wordpress-support-engineer-resume.docx
@@ -79,22 +79,6 @@
             <w:u w:val="single"/>
           </w:rPr>
           <w:t>GitHub</w:t>
-        </w:r>
-      </w:hyperlink>
-      <w:r>
-        <w:rPr>
-          <w:color w:val="525D6B"/>
-        </w:rPr>
-        <w:t xml:space="preserve">  ·  </w:t>
-      </w:r>
-      <w:hyperlink r:id="rId9">
-        <w:r>
-          <w:rPr>
-            <w:color w:val="1B5B84"/>
-            <w:szCs w:val="19"/>
-            <w:u w:val="single"/>
-          </w:rPr>
-          <w:t>WordPress profile</w:t>
         </w:r>
       </w:hyperlink>
     </w:p>
@@ -350,7 +334,7 @@
             <w:szCs w:val="19"/>
             <w:u w:val="single"/>
           </w:rPr>
-          <w:t>v0.3.52</w:t>
+          <w:t>v0.3.53</w:t>
         </w:r>
       </w:hyperlink>
       <w:r>
@@ -584,21 +568,7 @@
           <w:b/>
           <w:color w:val="183F5C"/>
         </w:rPr>
-        <w:t xml:space="preserve">LIVE + SHIPPED — </w:t>
-      </w:r>
-      <w:hyperlink r:id="rId22">
-        <w:r>
-          <w:rPr>
-            <w:b/>
-            <w:color w:val="1B5B84"/>
-            <w:szCs w:val="19"/>
-            <w:u w:val="single"/>
-          </w:rPr>
-          <w:t>v0.3.52</w:t>
-        </w:r>
-      </w:hyperlink>
-      <w:r>
-        <w:t xml:space="preserve"> at </w:t>
+        <w:t xml:space="preserve">LIVE + SHIPPED — v0.3.53 · </w:t>
       </w:r>
       <w:hyperlink r:id="rId23">
         <w:r>

</xml_diff>

<commit_message>
docs: correct resume release evidence
</commit_message>
<xml_diff>
--- a/assets/documents/henry-perkins-wordpress-support-engineer-resume.docx
+++ b/assets/documents/henry-perkins-wordpress-support-engineer-resume.docx
@@ -334,7 +334,7 @@
             <w:szCs w:val="19"/>
             <w:u w:val="single"/>
           </w:rPr>
-          <w:t>v0.3.53</w:t>
+          <w:t>v0.3.52</w:t>
         </w:r>
       </w:hyperlink>
       <w:r>
@@ -568,7 +568,25 @@
           <w:b/>
           <w:color w:val="183F5C"/>
         </w:rPr>
-        <w:t xml:space="preserve">LIVE + SHIPPED — v0.3.53 · </w:t>
+        <w:t xml:space="preserve">LIVE + SHIPPED — </w:t>
+      </w:r>
+      <w:hyperlink r:id="rId26">
+        <w:r>
+          <w:rPr>
+            <w:b/>
+            <w:color w:val="1B5B84"/>
+            <w:szCs w:val="19"/>
+            <w:u w:val="single"/>
+          </w:rPr>
+          <w:t>v0.3.53</w:t>
+        </w:r>
+      </w:hyperlink>
+      <w:r>
+        <w:rPr>
+          <w:b/>
+          <w:color w:val="183F5C"/>
+        </w:rPr>
+        <w:t xml:space="preserve"> · </w:t>
       </w:r>
       <w:hyperlink r:id="rId23">
         <w:r>

</xml_diff>

<commit_message>
Remove self-fixed theme regression from resume evidence
Drop the PRODUCTION ROOT-CAUSE DEBUGGING section (HPerkins Tokens focus-ring
incident). It was a defect I found and fixed on my own property with nothing
at stake, so it does not belong in the evidence stack alongside upstream
reports that cleared someone else's bar. The upstream contribution record
moves into that slot.

Also:
- Extend the #732 line with the PR #757 review outcome: reproduced the fix,
  confirmed capture, identified double-logging when a provider's own bridge
  stays active.
- Refresh the #732 open-state date to Jul 30, 2026 (re-verified upstream).
- Drop "browser verification against production CSS ordering" from the
  HPerkins Tokens entry; that harness was built for the removed incident.

PDF re-exported from the edited DOCX. Still one page.

Co-Authored-By: Claude Opus 5 (1M context) <noreply@anthropic.com>
</commit_message>
<xml_diff>
--- a/assets/documents/henry-perkins-wordpress-support-engineer-resume.docx
+++ b/assets/documents/henry-perkins-wordpress-support-engineer-resume.docx
@@ -267,93 +267,6 @@
           <w:b/>
           <w:color w:val="183F5C"/>
         </w:rPr>
-        <w:t>PRODUCTION ROOT-CAUSE DEBUGGING</w:t>
-      </w:r>
-    </w:p>
-    <w:p>
-      <w:pPr>
-        <w:pStyle w:val="ResumeEntry"/>
-        <w:keepNext/>
-      </w:pPr>
-      <w:r>
-        <w:rPr>
-          <w:b/>
-        </w:rPr>
-        <w:t>HPerkins Tokens — WordPress block theme</w:t>
-      </w:r>
-      <w:r>
-        <w:rPr>
-          <w:color w:val="525D6B"/>
-        </w:rPr>
-        <w:t xml:space="preserve">  |  production incident · Jul 2026</w:t>
-      </w:r>
-    </w:p>
-    <w:p>
-      <w:pPr>
-        <w:pStyle w:val="ResumeBody"/>
-        <w:spacing w:after="36"/>
-      </w:pPr>
-      <w:r>
-        <w:rPr>
-          <w:b/>
-          <w:color w:val="183F5C"/>
-        </w:rPr>
-        <w:t xml:space="preserve">SHIPPED — </w:t>
-      </w:r>
-      <w:r>
-        <w:t xml:space="preserve">Reproduced a production-only accessibility regression: Page Optimize reversed local stylesheet order; Assembler’s unresolved </w:t>
-      </w:r>
-      <w:r>
-        <w:rPr>
-          <w:b/>
-        </w:rPr>
-        <w:t>theme-4</w:t>
-      </w:r>
-      <w:r>
-        <w:t xml:space="preserve"> token invalidated the outline shorthand, and equal-specificity rules left buttons without visible keyboard focus rings. Fixed the cascade in </w:t>
-      </w:r>
-      <w:hyperlink r:id="rId13">
-        <w:r>
-          <w:rPr>
-            <w:b/>
-            <w:color w:val="1B5B84"/>
-            <w:szCs w:val="19"/>
-            <w:u w:val="single"/>
-          </w:rPr>
-          <w:t>commit c5dc3a1</w:t>
-        </w:r>
-      </w:hyperlink>
-      <w:r>
-        <w:t xml:space="preserve"> and added a browser regression that replays production ordering before asserting the 3px ring; released as </w:t>
-      </w:r>
-      <w:hyperlink r:id="rId14">
-        <w:r>
-          <w:rPr>
-            <w:b/>
-            <w:color w:val="1B5B84"/>
-            <w:szCs w:val="19"/>
-            <w:u w:val="single"/>
-          </w:rPr>
-          <w:t>v0.3.52</w:t>
-        </w:r>
-      </w:hyperlink>
-      <w:r>
-        <w:t>.</w:t>
-      </w:r>
-    </w:p>
-    <w:p>
-      <w:pPr>
-        <w:pStyle w:val="ResumeSection"/>
-        <w:keepNext/>
-        <w:pBdr>
-          <w:bottom w:val="single" w:sz="5" w:space="1" w:color="9FB3C5"/>
-        </w:pBdr>
-      </w:pPr>
-      <w:r>
-        <w:rPr>
-          <w:b/>
-          <w:color w:val="183F5C"/>
-        </w:rPr>
         <w:t>UPSTREAM WORDPRESS CONTRIBUTION RECORD</w:t>
       </w:r>
     </w:p>
@@ -463,7 +376,7 @@
         </w:r>
       </w:hyperlink>
       <w:r>
-        <w:t xml:space="preserve"> remains open as of Jul 21, 2026.</w:t>
+        <w:t xml:space="preserve"> remains open as of Jul 30, 2026. Reviewed and reproduced that fix, confirming capture and identifying a double-logging regression when a provider's own bridge stays active.</w:t>
       </w:r>
     </w:p>
     <w:p>
@@ -600,7 +513,7 @@
         </w:r>
       </w:hyperlink>
       <w:r>
-        <w:t>: theme.json tokens, Gutenberg patterns, accessible focus states, and browser verification against production CSS ordering.</w:t>
+        <w:t>: theme.json tokens, Gutenberg patterns, and accessible focus states.</w:t>
       </w:r>
     </w:p>
     <w:p>

</xml_diff>

<commit_message>
docs: refresh one-page support resume for WCUS
</commit_message>
<xml_diff>
--- a/assets/documents/henry-perkins-wordpress-support-engineer-resume.docx
+++ b/assets/documents/henry-perkins-wordpress-support-engineer-resume.docx
@@ -4,6 +4,7 @@
   <w:body>
     <w:p>
       <w:pPr>
+        <w:pStyle w:val="Heading1"/>
         <w:keepLines/>
         <w:spacing w:after="28"/>
       </w:pPr>
@@ -17,10 +18,7 @@
       </w:r>
     </w:p>
     <w:p>
-      <w:pPr>
-        <w:keepLines/>
-        <w:spacing w:after="42"/>
-      </w:pPr>
+      <w:pPr/>
       <w:r>
         <w:rPr>
           <w:b/>
@@ -29,17 +27,14 @@
       </w:r>
     </w:p>
     <w:p>
-      <w:pPr>
-        <w:keepLines/>
-        <w:spacing w:after="46"/>
-      </w:pPr>
+      <w:pPr/>
       <w:r>
         <w:rPr>
           <w:color w:val="525D6B"/>
         </w:rPr>
         <w:t xml:space="preserve">Chicago, IL  ·  </w:t>
       </w:r>
-      <w:hyperlink r:id="rId6">
+      <w:hyperlink r:id="rId6" w:history="1">
         <w:r>
           <w:rPr>
             <w:color w:val="1B5B84"/>
@@ -55,7 +50,7 @@
         </w:rPr>
         <w:t xml:space="preserve">  ·  </w:t>
       </w:r>
-      <w:hyperlink r:id="rId7">
+      <w:hyperlink r:id="rId7" w:history="1">
         <w:r>
           <w:rPr>
             <w:color w:val="1B5B84"/>
@@ -71,7 +66,7 @@
         </w:rPr>
         <w:t xml:space="preserve">  ·  </w:t>
       </w:r>
-      <w:hyperlink r:id="rId8">
+      <w:hyperlink r:id="rId8" w:history="1">
         <w:r>
           <w:rPr>
             <w:color w:val="1B5B84"/>
@@ -84,9 +79,20 @@
     </w:p>
     <w:p>
       <w:pPr>
-        <w:keepLines/>
-        <w:spacing w:after="46"/>
+        <w:pStyle w:val="ResumeEvent"/>
       </w:pPr>
+      <w:r>
+        <w:rPr>
+          <w:rFonts w:ascii="Calibri" w:hAnsi="Calibri"/>
+          <w:b/>
+          <w:color w:val="9A7530"/>
+          <w:sz w:val="17"/>
+        </w:rPr>
+        <w:t>WORDCAMP US 2026 — Phoenix, Aug 16–19 · Selected to staff the Core AI booth</w:t>
+      </w:r>
+    </w:p>
+    <w:p>
+      <w:pPr/>
       <w:r>
         <w:rPr>
           <w:b/>
@@ -100,7 +106,7 @@
     </w:p>
     <w:p>
       <w:pPr>
-        <w:pStyle w:val="ResumeSection"/>
+        <w:pStyle w:val="Heading2"/>
         <w:keepNext/>
         <w:pBdr>
           <w:bottom w:val="single" w:sz="5" w:space="1" w:color="9FB3C5"/>
@@ -135,15 +141,15 @@
     <w:p>
       <w:pPr>
         <w:pStyle w:val="ResumeBody"/>
-        <w:spacing w:after="36"/>
+        <w:spacing w:after="12"/>
       </w:pPr>
       <w:r>
-        <w:t>Resolved WordPress.com user issues across publishing, site configuration, billing, domains, and DNS; wrote clear troubleshooting that addressed root causes rather than symptoms. Turned recurring problems into documentation, bug reports, and reproducible details for product and engineering.</w:t>
+        <w:t>Resolved WordPress.com issues across publishing, configuration, billing, domains, and DNS; wrote root-cause troubleshooting and reproducible details for customers, product, and engineering.</w:t>
       </w:r>
     </w:p>
     <w:p>
       <w:pPr>
-        <w:pStyle w:val="ResumeSection"/>
+        <w:pStyle w:val="Heading2"/>
         <w:keepNext/>
         <w:pBdr>
           <w:bottom w:val="single" w:sz="5" w:space="1" w:color="9FB3C5"/>
@@ -178,21 +184,18 @@
     <w:p>
       <w:pPr>
         <w:pStyle w:val="ResumeBody"/>
+        <w:spacing w:after="12"/>
       </w:pPr>
       <w:r>
         <w:rPr>
           <w:b/>
           <w:color w:val="183F5C"/>
         </w:rPr>
-        <w:t xml:space="preserve">LIVE — </w:t>
+        <w:t xml:space="preserve">LIVE — Delivered </w:t>
       </w:r>
-      <w:r>
-        <w:t xml:space="preserve">Delivered </w:t>
-      </w:r>
-      <w:hyperlink r:id="rId10">
+      <w:hyperlink r:id="rId9" w:history="1">
         <w:r>
           <w:rPr>
-            <w:b/>
             <w:color w:val="1B5B84"/>
             <w:szCs w:val="19"/>
             <w:u w:val="single"/>
@@ -201,62 +204,25 @@
         </w:r>
       </w:hyperlink>
       <w:r>
-        <w:t xml:space="preserve"> from discovery through launch: a booking-first, one-screen flow rebuilt from React as static JavaScript on one Cloudflare Worker, with a server-side </w:t>
+        <w:t xml:space="preserve"> from discovery through launch: a booking-first static JavaScript experience on one Cloudflare Worker with a validated server-side booking route; </w:t>
       </w:r>
-      <w:r>
-        <w:rPr>
-          <w:b/>
-        </w:rPr>
-        <w:t>/api/booking</w:t>
-      </w:r>
-      <w:r>
-        <w:t xml:space="preserve"> </w:t>
-      </w:r>
-      <w:r>
-        <w:t>endpoint configured to route requests to the ministry inboxes</w:t>
-      </w:r>
-      <w:r>
-        <w:t xml:space="preserve"> and no form vendor in the path.</w:t>
-      </w:r>
-    </w:p>
-    <w:p>
-      <w:pPr>
-        <w:pStyle w:val="ResumeBody"/>
-        <w:spacing w:after="36"/>
-      </w:pPr>
-      <w:r>
-        <w:t xml:space="preserve">Made delivery and iteration inspectable through the </w:t>
-      </w:r>
-      <w:hyperlink r:id="rId11">
+      <w:hyperlink r:id="rId10" w:history="1">
         <w:r>
           <w:rPr>
             <w:color w:val="1B5B84"/>
             <w:szCs w:val="19"/>
             <w:u w:val="single"/>
           </w:rPr>
-          <w:t>shipped second design</w:t>
+          <w:t>public source</w:t>
         </w:r>
       </w:hyperlink>
       <w:r>
-        <w:t xml:space="preserve"> and the </w:t>
-      </w:r>
-      <w:hyperlink r:id="rId12">
-        <w:r>
-          <w:rPr>
-            <w:color w:val="1B5B84"/>
-            <w:szCs w:val="19"/>
-            <w:u w:val="single"/>
-          </w:rPr>
-          <w:t>prior public build</w:t>
-        </w:r>
-      </w:hyperlink>
-      <w:r>
-        <w:t>.</w:t>
+        <w:t xml:space="preserve"> keeps the handoff inspectable.</w:t>
       </w:r>
     </w:p>
     <w:p>
       <w:pPr>
-        <w:pStyle w:val="ResumeSection"/>
+        <w:pStyle w:val="Heading2"/>
         <w:keepNext/>
         <w:pBdr>
           <w:bottom w:val="single" w:sz="5" w:space="1" w:color="9FB3C5"/>
@@ -273,7 +239,7 @@
     <w:p>
       <w:pPr>
         <w:pStyle w:val="ResumeBody"/>
-        <w:spacing w:after="16"/>
+        <w:spacing w:after="12"/>
       </w:pPr>
       <w:r>
         <w:rPr>
@@ -282,10 +248,9 @@
         </w:rPr>
         <w:t xml:space="preserve">MERGED — </w:t>
       </w:r>
-      <w:hyperlink r:id="rId15">
+      <w:hyperlink r:id="rId11" w:history="1">
         <w:r>
           <w:rPr>
-            <w:b/>
             <w:color w:val="1B5B84"/>
             <w:szCs w:val="19"/>
             <w:u w:val="single"/>
@@ -300,7 +265,59 @@
     <w:p>
       <w:pPr>
         <w:pStyle w:val="ResumeBody"/>
-        <w:spacing w:after="16"/>
+        <w:spacing w:after="12"/>
+      </w:pPr>
+      <w:r>
+        <w:rPr>
+          <w:b/>
+          <w:color w:val="183F5C"/>
+        </w:rPr>
+        <w:t xml:space="preserve">OPEN UPSTREAM CODE — </w:t>
+      </w:r>
+      <w:hyperlink r:id="rId12" w:history="1">
+        <w:r>
+          <w:rPr>
+            <w:color w:val="1B5B84"/>
+            <w:szCs w:val="19"/>
+            <w:u w:val="single"/>
+          </w:rPr>
+          <w:t>WordPress/php-ai-client PR #263</w:t>
+        </w:r>
+      </w:hyperlink>
+      <w:r>
+        <w:t>: authored regression coverage and finite-vector validation rejecting NAN, INF, and -INF embedding values.</w:t>
+      </w:r>
+    </w:p>
+    <w:p>
+      <w:pPr>
+        <w:pStyle w:val="ResumeBody"/>
+        <w:spacing w:after="12"/>
+      </w:pPr>
+      <w:r>
+        <w:rPr>
+          <w:b/>
+          <w:color w:val="183F5C"/>
+        </w:rPr>
+        <w:t xml:space="preserve">OPEN UPSTREAM CODE — </w:t>
+      </w:r>
+      <w:hyperlink r:id="rId13" w:history="1">
+        <w:r>
+          <w:rPr>
+            <w:color w:val="1B5B84"/>
+            <w:szCs w:val="19"/>
+            <w:u w:val="single"/>
+          </w:rPr>
+          <w:t>WordPress/ai-provider-for-openai PR #40</w:t>
+        </w:r>
+      </w:hyperlink>
+      <w:r>
+        <w:t>: authored model-aware sampling compatibility metadata and tests for OpenAI reasoning models.</w:t>
+      </w:r>
+    </w:p>
+    <w:p>
+      <w:pPr>
+        <w:pStyle w:val="ResumeBody"/>
+        <w:spacing w:after="12"/>
       </w:pPr>
       <w:r>
         <w:rPr>
@@ -309,10 +326,9 @@
         </w:rPr>
         <w:t xml:space="preserve">REPORTED · FIX SHIPPED — </w:t>
       </w:r>
-      <w:hyperlink r:id="rId16">
+      <w:hyperlink r:id="rId14" w:history="1">
         <w:r>
           <w:rPr>
-            <w:b/>
             <w:color w:val="1B5B84"/>
             <w:szCs w:val="19"/>
             <w:u w:val="single"/>
@@ -321,12 +337,11 @@
         </w:r>
       </w:hyperlink>
       <w:r>
-        <w:t xml:space="preserve">: reported a Guidelines content-type defect; the maintainer fix in </w:t>
+        <w:t xml:space="preserve">: reported and reproduced a Guidelines content-type defect; a maintainer authored </w:t>
       </w:r>
-      <w:hyperlink r:id="rId17">
+      <w:hyperlink r:id="rId15" w:history="1">
         <w:r>
           <w:rPr>
-            <w:b/>
             <w:color w:val="1B5B84"/>
             <w:szCs w:val="19"/>
             <w:u w:val="single"/>
@@ -335,25 +350,37 @@
         </w:r>
       </w:hyperlink>
       <w:r>
-        <w:t xml:space="preserve"> merged May 20 and shipped in WordPress AI Plugin 1.0.1.</w:t>
+        <w:t xml:space="preserve"> and </w:t>
+      </w:r>
+      <w:hyperlink r:id="rId16" w:history="1">
+        <w:r>
+          <w:rPr>
+            <w:color w:val="1B5B84"/>
+            <w:szCs w:val="19"/>
+            <w:u w:val="single"/>
+          </w:rPr>
+          <w:t>WordPress AI 1.0.1</w:t>
+        </w:r>
+      </w:hyperlink>
+      <w:r>
+        <w:t xml:space="preserve"> shipped it.</w:t>
       </w:r>
     </w:p>
     <w:p>
       <w:pPr>
         <w:pStyle w:val="ResumeBody"/>
-        <w:spacing w:after="36"/>
+        <w:spacing w:after="12"/>
       </w:pPr>
       <w:r>
         <w:rPr>
           <w:b/>
           <w:color w:val="183F5C"/>
         </w:rPr>
-        <w:t xml:space="preserve">OPEN — </w:t>
+        <w:t xml:space="preserve">REPORTED · INTEGRATION TESTED — </w:t>
       </w:r>
-      <w:hyperlink r:id="rId18">
+      <w:hyperlink r:id="rId17" w:history="1">
         <w:r>
           <w:rPr>
-            <w:b/>
             <w:color w:val="1B5B84"/>
             <w:szCs w:val="19"/>
             <w:u w:val="single"/>
@@ -362,12 +389,11 @@
         </w:r>
       </w:hyperlink>
       <w:r>
-        <w:t xml:space="preserve">: reported the custom-transport request-logging gap; the provider-agnostic fix in </w:t>
+        <w:t xml:space="preserve">: authored the report and reproduction. Anubhav Anand authored </w:t>
       </w:r>
-      <w:hyperlink r:id="rId19">
+      <w:hyperlink r:id="rId18" w:history="1">
         <w:r>
           <w:rPr>
-            <w:b/>
             <w:color w:val="1B5B84"/>
             <w:szCs w:val="19"/>
             <w:u w:val="single"/>
@@ -376,12 +402,12 @@
         </w:r>
       </w:hyperlink>
       <w:r>
-        <w:t xml:space="preserve"> remains open as of Jul 30, 2026. Reviewed and reproduced that fix, confirming capture and identifying a double-logging regression when a provider's own bridge stays active.</w:t>
+        <w:t>; Henry tested lifecycle capture, found duplicate successes and missing failures, and proposed the ownership split.</w:t>
       </w:r>
     </w:p>
     <w:p>
       <w:pPr>
-        <w:pStyle w:val="ResumeSection"/>
+        <w:pStyle w:val="Heading2"/>
         <w:keepNext/>
         <w:pBdr>
           <w:bottom w:val="single" w:sz="5" w:space="1" w:color="9FB3C5"/>
@@ -393,6 +419,50 @@
           <w:color w:val="183F5C"/>
         </w:rPr>
         <w:t>TECHNICAL PROOF</w:t>
+      </w:r>
+    </w:p>
+    <w:p>
+      <w:pPr>
+        <w:pStyle w:val="ResumeEntry"/>
+        <w:keepNext/>
+      </w:pPr>
+      <w:r>
+        <w:rPr>
+          <w:b/>
+        </w:rPr>
+        <w:t>Flavor Agent — Author</w:t>
+      </w:r>
+      <w:r>
+        <w:rPr>
+          <w:color w:val="525D6B"/>
+        </w:rPr>
+        <w:t xml:space="preserve">  |  WordPress agent-governance plugin</w:t>
+      </w:r>
+    </w:p>
+    <w:p>
+      <w:pPr>
+        <w:pStyle w:val="ResumeBody"/>
+        <w:spacing w:after="12"/>
+      </w:pPr>
+      <w:r>
+        <w:rPr>
+          <w:b/>
+          <w:color w:val="183F5C"/>
+        </w:rPr>
+        <w:t xml:space="preserve">PRERELEASE + ACTIVE — </w:t>
+      </w:r>
+      <w:hyperlink r:id="rId19" w:history="1">
+        <w:r>
+          <w:rPr>
+            <w:color w:val="1B5B84"/>
+            <w:szCs w:val="19"/>
+            <w:u w:val="single"/>
+          </w:rPr>
+          <w:t>v0.1.0-rc.3</w:t>
+        </w:r>
+      </w:hyperlink>
+      <w:r>
+        <w:t xml:space="preserve"> is the latest public prerelease; post-RC3 main adds governed content/template apply and undo, schema hardening, and canonical target authorization; unreleased.</w:t>
       </w:r>
     </w:p>
     <w:p>
@@ -416,19 +486,18 @@
     <w:p>
       <w:pPr>
         <w:pStyle w:val="ResumeBody"/>
-        <w:spacing w:after="16"/>
+        <w:spacing w:after="12"/>
       </w:pPr>
       <w:r>
         <w:rPr>
           <w:b/>
           <w:color w:val="183F5C"/>
         </w:rPr>
-        <w:t xml:space="preserve">SHIPPED — </w:t>
+        <w:t xml:space="preserve">RELEASED OWNED WORK — </w:t>
       </w:r>
-      <w:hyperlink r:id="rId20">
+      <w:hyperlink r:id="rId20" w:history="1">
         <w:r>
           <w:rPr>
-            <w:b/>
             <w:color w:val="1B5B84"/>
             <w:szCs w:val="19"/>
             <w:u w:val="single"/>
@@ -437,20 +506,7 @@
         </w:r>
       </w:hyperlink>
       <w:r>
-        <w:t xml:space="preserve"> (Jul 2, 2026; </w:t>
-      </w:r>
-      <w:hyperlink r:id="rId21">
-        <w:r>
-          <w:rPr>
-            <w:color w:val="1B5B84"/>
-            <w:szCs w:val="19"/>
-            <w:u w:val="single"/>
-          </w:rPr>
-          <w:t>commit 2827bb5</w:t>
-        </w:r>
-      </w:hyperlink>
-      <w:r>
-        <w:t>): WordPress AI Client provider for Codex text and capability-gated image generation, using a localhost sidecar and isolated per-user runtime state. Released independently; not merged into WordPress/ai.</w:t>
+        <w:t>: WordPress AI Client provider for Codex text and capability-gated image generation with isolated per-user runtime state.</w:t>
       </w:r>
     </w:p>
     <w:p>
@@ -474,19 +530,18 @@
     <w:p>
       <w:pPr>
         <w:pStyle w:val="ResumeBody"/>
-        <w:spacing w:after="36"/>
+        <w:spacing w:after="12"/>
       </w:pPr>
       <w:r>
         <w:rPr>
           <w:b/>
           <w:color w:val="183F5C"/>
         </w:rPr>
-        <w:t xml:space="preserve">LIVE + SHIPPED — </w:t>
+        <w:t xml:space="preserve">RELEASED OWNED WORK — </w:t>
       </w:r>
-      <w:hyperlink r:id="rId26">
+      <w:hyperlink r:id="rId21" w:history="1">
         <w:r>
           <w:rPr>
-            <w:b/>
             <w:color w:val="1B5B84"/>
             <w:szCs w:val="19"/>
             <w:u w:val="single"/>
@@ -495,16 +550,11 @@
         </w:r>
       </w:hyperlink>
       <w:r>
-        <w:rPr>
-          <w:b/>
-          <w:color w:val="183F5C"/>
-        </w:rPr>
         <w:t xml:space="preserve"> · </w:t>
       </w:r>
-      <w:hyperlink r:id="rId23">
+      <w:hyperlink r:id="rId7" w:history="1">
         <w:r>
           <w:rPr>
-            <w:b/>
             <w:color w:val="1B5B84"/>
             <w:szCs w:val="19"/>
             <w:u w:val="single"/>
@@ -513,12 +563,12 @@
         </w:r>
       </w:hyperlink>
       <w:r>
-        <w:t>: theme.json tokens, Gutenberg patterns, and accessible focus states.</w:t>
+        <w:t>: token-governed block theme and accessible evidence system. Later commerce work is merged to main and unreleased.</w:t>
       </w:r>
     </w:p>
     <w:p>
       <w:pPr>
-        <w:pStyle w:val="ResumeSection"/>
+        <w:pStyle w:val="Heading2"/>
         <w:keepNext/>
         <w:pBdr>
           <w:bottom w:val="single" w:sz="5" w:space="1" w:color="9FB3C5"/>
@@ -535,49 +585,19 @@
     <w:p>
       <w:pPr>
         <w:pStyle w:val="ResumeBody"/>
-        <w:spacing w:after="16"/>
+        <w:spacing w:after="12"/>
       </w:pPr>
       <w:r>
-        <w:rPr>
-          <w:b/>
-        </w:rPr>
-        <w:t xml:space="preserve">WordPress: </w:t>
-      </w:r>
-      <w:r>
-        <w:t xml:space="preserve">PHP, JavaScript, Gutenberg, REST API, WP-CLI  ·  </w:t>
-      </w:r>
-      <w:r>
-        <w:rPr>
-          <w:b/>
-        </w:rPr>
-        <w:t xml:space="preserve">Support: </w:t>
-      </w:r>
-      <w:r>
-        <w:t xml:space="preserve">HTTP, DNS, CSS cascade, browser debugging, escalation triage, customer communication  ·  </w:t>
-      </w:r>
-      <w:r>
-        <w:rPr>
-          <w:b/>
-        </w:rPr>
-        <w:t xml:space="preserve">Tooling: </w:t>
-      </w:r>
-      <w:r>
-        <w:t>Git/GitHub, GitHub Actions, Plugin Check, PHPStan, Cloudflare Workers.</w:t>
+        <w:t>WordPress: PHP, JavaScript, Gutenberg, REST API, WP-CLI  ·  Support: HTTP, DNS, CSS cascade, browser debugging, escalation triage, customer communication  ·  Tooling: Git/GitHub, GitHub Actions, Plugin Check, PHPStan, Cloudflare Workers.</w:t>
       </w:r>
     </w:p>
     <w:p>
       <w:pPr>
         <w:pStyle w:val="ResumeBody"/>
-        <w:spacing w:after="0"/>
+        <w:spacing w:after="12"/>
       </w:pPr>
       <w:r>
-        <w:rPr>
-          <w:b/>
-        </w:rPr>
-        <w:t xml:space="preserve">Earlier customer and operations roles: </w:t>
-      </w:r>
-      <w:r>
-        <w:t>Starbucks Shift Supervisor (2019–2022); Sodexo Starbucks Manager (2018–2019); Clinique Consultant (2015–2017); PageLines Developer Community Manager (2012); Micro Center Customer Service/Sales (2009–2012).</w:t>
+        <w:t>Earlier customer and operations roles: Starbucks Shift Supervisor (2019–2022); Sodexo Starbucks Manager (2018–2019); Clinique Consultant (2015–2017); PageLines Developer Community Manager (2012); Micro Center Customer Service/Sales (2009–2012).</w:t>
       </w:r>
     </w:p>
     <w:sectPr>
@@ -1201,17 +1221,16 @@
     <w:qFormat/>
     <w:rsid w:val="00FC693F"/>
     <w:pPr>
-      <w:keepNext/>
       <w:keepLines/>
-      <w:spacing w:before="480" w:after="0"/>
+      <w:spacing w:after="28"/>
       <w:outlineLvl w:val="0"/>
     </w:pPr>
     <w:rPr>
-      <w:rFonts w:asciiTheme="majorHAnsi" w:eastAsiaTheme="majorEastAsia" w:hAnsiTheme="majorHAnsi" w:cstheme="majorBidi"/>
+      <w:rFonts w:asciiTheme="majorHAnsi" w:eastAsiaTheme="majorEastAsia" w:hAnsiTheme="majorHAnsi" w:cstheme="majorBidi" w:ascii="Calibri" w:hAnsi="Calibri"/>
       <w:b/>
       <w:bCs/>
-      <w:color w:val="365F91" w:themeColor="accent1" w:themeShade="BF"/>
-      <w:sz w:val="28"/>
+      <w:color w:val="183F5C"/>
+      <w:sz w:val="35"/>
       <w:szCs w:val="28"/>
     </w:rPr>
   </w:style>
@@ -1226,16 +1245,15 @@
     <w:rsid w:val="00FC693F"/>
     <w:pPr>
       <w:keepNext/>
-      <w:keepLines/>
-      <w:spacing w:before="200" w:after="0"/>
+      <w:spacing/>
       <w:outlineLvl w:val="1"/>
     </w:pPr>
     <w:rPr>
-      <w:rFonts w:asciiTheme="majorHAnsi" w:eastAsiaTheme="majorEastAsia" w:hAnsiTheme="majorHAnsi" w:cstheme="majorBidi"/>
+      <w:rFonts w:asciiTheme="majorHAnsi" w:eastAsiaTheme="majorEastAsia" w:hAnsiTheme="majorHAnsi" w:cstheme="majorBidi" w:ascii="Calibri" w:hAnsi="Calibri"/>
       <w:b/>
       <w:bCs/>
-      <w:color w:val="4F81BD" w:themeColor="accent1"/>
-      <w:sz w:val="26"/>
+      <w:color w:val="183F5C"/>
+      <w:sz w:val="19"/>
       <w:szCs w:val="26"/>
     </w:rPr>
   </w:style>
@@ -12195,6 +12213,20 @@
     <w:pPr>
       <w:spacing w:before="86" w:after="44"/>
     </w:pPr>
+  </w:style>
+  <w:style w:type="paragraph" w:customStyle="1" w:styleId="ResumeEvent">
+    <w:name w:val="Resume Event"/>
+    <w:basedOn w:val="Normal"/>
+    <w:pPr>
+      <w:keepLines/>
+      <w:spacing w:before="0" w:after="24" w:line="240" w:lineRule="auto"/>
+    </w:pPr>
+    <w:rPr>
+      <w:rFonts w:ascii="Calibri" w:hAnsi="Calibri"/>
+      <w:b/>
+      <w:color w:val="9A7530"/>
+      <w:sz w:val="17"/>
+    </w:rPr>
   </w:style>
 </w:styles>
 </file>

</xml_diff>

<commit_message>
Refresh support resume and stabilize regeneration
Update the support-focused evidence, release status, and AI-assisted
attribution, and regenerate the matching tagged one-page PDF. Normalize
section spacing on the first generator pass to prevent a second-run change.

Exported with LibreOffice 26.2.5.2 and Carlito 20220224 in a temporary Linux
container. Normalize annotation reading order while retaining every link's
target, rectangle, and structure key. Confirm rendering in PDFium and Poppler.

Validation: 324 Node tests on Node 22.23.2, 8 Python tests, DOCX/PDF text and
link/tag parity, placement artifact contracts with live links, 32 PHP lints,
performance assets, Impeccable artifacts, resume route source, and diff check.
</commit_message>
<xml_diff>
--- a/assets/documents/henry-perkins-wordpress-support-engineer-resume.docx
+++ b/assets/documents/henry-perkins-wordpress-support-engineer-resume.docx
@@ -23,7 +23,7 @@
         <w:rPr>
           <w:b/>
         </w:rPr>
-        <w:t>PHP · JavaScript · Gutenberg · REST/HTTP/DNS · Root-cause debugging · Customer communication</w:t>
+        <w:t>WordPress · Gutenberg · REST/HTTP/DNS · Defect reproduction · Fix validation · Customer communication</w:t>
       </w:r>
     </w:p>
     <w:p>
@@ -38,7 +38,6 @@
         <w:r>
           <w:rPr>
             <w:color w:val="1B5B84"/>
-            <w:szCs w:val="19"/>
             <w:u w:val="single"/>
           </w:rPr>
           <w:t>htperkins@gmail.com</w:t>
@@ -54,7 +53,6 @@
         <w:r>
           <w:rPr>
             <w:color w:val="1B5B84"/>
-            <w:szCs w:val="19"/>
             <w:u w:val="single"/>
           </w:rPr>
           <w:t>hperkins.blog</w:t>
@@ -70,7 +68,6 @@
         <w:r>
           <w:rPr>
             <w:color w:val="1B5B84"/>
-            <w:szCs w:val="19"/>
             <w:u w:val="single"/>
           </w:rPr>
           <w:t>GitHub</w:t>
@@ -86,22 +83,17 @@
           <w:rFonts w:ascii="Calibri" w:hAnsi="Calibri"/>
           <w:b/>
           <w:color w:val="9A7530"/>
-          <w:sz w:val="17"/>
+          <w:sz w:val="18"/>
         </w:rPr>
-        <w:t>WORDCAMP US 2026 — Phoenix, Aug 16–19 · Selected to staff the Core AI booth</w:t>
+        <w:t>WORDCAMP US 2026 — Phoenix · Staffed the Core AI booth, walking maintainers and agency developers through AI provider tooling</w:t>
       </w:r>
     </w:p>
     <w:p>
-      <w:pPr/>
+      <w:pPr>
+        <w:spacing w:after="60"/>
+      </w:pPr>
       <w:r>
-        <w:rPr>
-          <w:b/>
-          <w:color w:val="183F5C"/>
-        </w:rPr>
-        <w:t>TARGET: SUPPORT ENGINEER</w:t>
-      </w:r>
-      <w:r>
-        <w:t xml:space="preserve"> — WordPress support, site delivery, root-cause debugging, and clear handoff between customers and engineering.</w:t>
+        <w:t>WordPress support professional with prior WordPress.com support experience, current independent client delivery, and upstream WordPress contributions. Reproduces defects, tests fixes, and reports findings to customers and engineering.</w:t>
       </w:r>
     </w:p>
     <w:p>
@@ -111,19 +103,96 @@
         <w:pBdr>
           <w:bottom w:val="single" w:sz="5" w:space="1" w:color="9FB3C5"/>
         </w:pBdr>
+        <w:spacing w:before="120" w:after="40"/>
       </w:pPr>
       <w:r>
         <w:rPr>
           <w:b/>
           <w:color w:val="183F5C"/>
         </w:rPr>
-        <w:t>WORDPRESS.COM SUPPORT</w:t>
+        <w:t>EXPERIENCE</w:t>
       </w:r>
     </w:p>
     <w:p>
       <w:pPr>
         <w:pStyle w:val="ResumeEntry"/>
         <w:keepNext/>
+        <w:spacing w:before="60" w:after="10"/>
+      </w:pPr>
+      <w:r>
+        <w:rPr>
+          <w:b/>
+        </w:rPr>
+        <w:t>Independent Technology Consultant — Lakefront Digital</w:t>
+      </w:r>
+      <w:r>
+        <w:rPr>
+          <w:color w:val="525D6B"/>
+        </w:rPr>
+        <w:t xml:space="preserve">  |  Oct 2022–Present · Chicago, remote</w:t>
+      </w:r>
+    </w:p>
+    <w:p>
+      <w:pPr>
+        <w:pStyle w:val="ResumeBody"/>
+        <w:spacing w:after="40"/>
+      </w:pPr>
+      <w:r>
+        <w:rPr>
+          <w:b/>
+          <w:color w:val="183F5C"/>
+        </w:rPr>
+        <w:t xml:space="preserve">Delivery scope — </w:t>
+      </w:r>
+      <w:r>
+        <w:t>WordPress builds, API integrations, and documentation from discovery through post-launch support.</w:t>
+      </w:r>
+    </w:p>
+    <w:p>
+      <w:pPr>
+        <w:pStyle w:val="ResumeBody"/>
+        <w:spacing w:after="40"/>
+      </w:pPr>
+      <w:r>
+        <w:rPr>
+          <w:b/>
+          <w:color w:val="183F5C"/>
+        </w:rPr>
+        <w:t xml:space="preserve">Client launch — </w:t>
+      </w:r>
+      <w:r>
+        <w:t xml:space="preserve">Delivered </w:t>
+      </w:r>
+      <w:hyperlink r:id="rId9" w:history="1">
+        <w:r>
+          <w:rPr>
+            <w:color w:val="1B5B84"/>
+            <w:u w:val="single"/>
+          </w:rPr>
+          <w:t>DJ Lee &amp; Voices of Judah</w:t>
+        </w:r>
+      </w:hyperlink>
+      <w:r>
+        <w:t xml:space="preserve">’s booking-focused website from discovery through launch, including server-side booking validation and </w:t>
+      </w:r>
+      <w:hyperlink r:id="rId10" w:history="1">
+        <w:r>
+          <w:rPr>
+            <w:color w:val="1B5B84"/>
+            <w:u w:val="single"/>
+          </w:rPr>
+          <w:t>publicly available source code</w:t>
+        </w:r>
+      </w:hyperlink>
+      <w:r>
+        <w:t>.</w:t>
+      </w:r>
+    </w:p>
+    <w:p>
+      <w:pPr>
+        <w:pStyle w:val="ResumeEntry"/>
+        <w:keepNext/>
+        <w:spacing w:before="60" w:after="10"/>
       </w:pPr>
       <w:r>
         <w:rPr>
@@ -135,16 +204,16 @@
         <w:rPr>
           <w:color w:val="525D6B"/>
         </w:rPr>
-        <w:t xml:space="preserve">  |  Remote · Oct–Nov 2012</w:t>
+        <w:t xml:space="preserve">  |  WordPress.com · Remote · Oct–Nov 2012</w:t>
       </w:r>
     </w:p>
     <w:p>
       <w:pPr>
         <w:pStyle w:val="ResumeBody"/>
-        <w:spacing w:after="12"/>
+        <w:spacing w:after="40"/>
       </w:pPr>
       <w:r>
-        <w:t>Resolved WordPress.com issues across publishing, configuration, billing, domains, and DNS; wrote root-cause troubleshooting and reproducible details for customers, product, and engineering.</w:t>
+        <w:t>Resolved WordPress.com issues across publishing, configuration, billing, domains, and DNS, turning recurring problems into documentation and reproducible bug reports for customers, product, and engineering.</w:t>
       </w:r>
     </w:p>
     <w:p>
@@ -154,70 +223,190 @@
         <w:pBdr>
           <w:bottom w:val="single" w:sz="5" w:space="1" w:color="9FB3C5"/>
         </w:pBdr>
+        <w:spacing w:before="120" w:after="40"/>
       </w:pPr>
       <w:r>
         <w:rPr>
           <w:b/>
           <w:color w:val="183F5C"/>
         </w:rPr>
-        <w:t>NAMED CLIENT DELIVERY</w:t>
-      </w:r>
-    </w:p>
-    <w:p>
-      <w:pPr>
-        <w:pStyle w:val="ResumeEntry"/>
-        <w:keepNext/>
-      </w:pPr>
-      <w:r>
-        <w:rPr>
-          <w:b/>
-        </w:rPr>
-        <w:t>Independent Technology Consultant</w:t>
-      </w:r>
-      <w:r>
-        <w:rPr>
-          <w:color w:val="525D6B"/>
-        </w:rPr>
-        <w:t xml:space="preserve">  |  Oct 2022–Present · selected delivery in 2026</w:t>
+        <w:t>SELECTED WORDPRESS INVESTIGATIONS &amp; CONTRIBUTIONS</w:t>
       </w:r>
     </w:p>
     <w:p>
       <w:pPr>
         <w:pStyle w:val="ResumeBody"/>
-        <w:spacing w:after="12"/>
+        <w:spacing w:after="40"/>
       </w:pPr>
       <w:r>
         <w:rPr>
           <w:b/>
           <w:color w:val="183F5C"/>
         </w:rPr>
-        <w:t xml:space="preserve">LIVE — Delivered </w:t>
+        <w:t xml:space="preserve">Defect reproduction — </w:t>
       </w:r>
-      <w:hyperlink r:id="rId9" w:history="1">
+      <w:r>
+        <w:t>Reported and reproduced a WordPress AI Guidelines defect (</w:t>
+      </w:r>
+      <w:hyperlink r:id="rId11" w:history="1">
         <w:r>
           <w:rPr>
             <w:color w:val="1B5B84"/>
-            <w:szCs w:val="19"/>
             <w:u w:val="single"/>
           </w:rPr>
-          <w:t>DJ Lee &amp; Voices of Judah</w:t>
+          <w:t>Issue #529</w:t>
         </w:r>
       </w:hyperlink>
       <w:r>
-        <w:t xml:space="preserve"> from discovery through launch: a booking-first static JavaScript experience on one Cloudflare Worker with a validated server-side booking route; </w:t>
+        <w:t xml:space="preserve">): an artifact guideline could shadow the content guideline. A maintainer’s fix, </w:t>
       </w:r>
-      <w:hyperlink r:id="rId10" w:history="1">
+      <w:hyperlink r:id="rId12" w:history="1">
         <w:r>
           <w:rPr>
             <w:color w:val="1B5B84"/>
-            <w:szCs w:val="19"/>
             <w:u w:val="single"/>
           </w:rPr>
-          <w:t>public source</w:t>
+          <w:t>PR #593</w:t>
         </w:r>
       </w:hyperlink>
       <w:r>
-        <w:t xml:space="preserve"> keeps the handoff inspectable.</w:t>
+        <w:t xml:space="preserve">, shipped in </w:t>
+      </w:r>
+      <w:hyperlink r:id="rId13" w:history="1">
+        <w:r>
+          <w:rPr>
+            <w:color w:val="1B5B84"/>
+            <w:u w:val="single"/>
+          </w:rPr>
+          <w:t>WordPress AI 1.0.1</w:t>
+        </w:r>
+      </w:hyperlink>
+      <w:r>
+        <w:t>.</w:t>
+      </w:r>
+    </w:p>
+    <w:p>
+      <w:pPr>
+        <w:pStyle w:val="ResumeBody"/>
+        <w:spacing w:after="40"/>
+      </w:pPr>
+      <w:r>
+        <w:rPr>
+          <w:b/>
+          <w:color w:val="183F5C"/>
+        </w:rPr>
+        <w:t xml:space="preserve">Fix validation — </w:t>
+      </w:r>
+      <w:r>
+        <w:t>Reported a WordPress AI request-logging gap (</w:t>
+      </w:r>
+      <w:hyperlink r:id="rId14" w:history="1">
+        <w:r>
+          <w:rPr>
+            <w:color w:val="1B5B84"/>
+            <w:u w:val="single"/>
+          </w:rPr>
+          <w:t>Issue #732</w:t>
+        </w:r>
+      </w:hyperlink>
+      <w:r>
+        <w:t>); integration-tested Anubhav Anand’s proposed fix (</w:t>
+      </w:r>
+      <w:hyperlink r:id="rId15" w:history="1">
+        <w:r>
+          <w:rPr>
+            <w:color w:val="1B5B84"/>
+            <w:u w:val="single"/>
+          </w:rPr>
+          <w:t>PR #757</w:t>
+        </w:r>
+      </w:hyperlink>
+      <w:r>
+        <w:t>, open), found duplicate successes and missing failures, and proposed the ownership split.</w:t>
+      </w:r>
+    </w:p>
+    <w:p>
+      <w:pPr>
+        <w:pStyle w:val="ResumeBody"/>
+        <w:spacing w:after="40"/>
+      </w:pPr>
+      <w:r>
+        <w:rPr>
+          <w:b/>
+          <w:color w:val="183F5C"/>
+        </w:rPr>
+        <w:t xml:space="preserve">Documentation — </w:t>
+      </w:r>
+      <w:r>
+        <w:t xml:space="preserve">Wrote and refined the Content Resizing and Title Generation experiment documentation in </w:t>
+      </w:r>
+      <w:hyperlink r:id="rId16" w:history="1">
+        <w:r>
+          <w:rPr>
+            <w:color w:val="1B5B84"/>
+            <w:u w:val="single"/>
+          </w:rPr>
+          <w:t>WordPress/ai PR #501</w:t>
+        </w:r>
+      </w:hyperlink>
+      <w:r>
+        <w:t>; merged May 18, 2026 and credited in the 1.0.0 release notes.</w:t>
+      </w:r>
+    </w:p>
+    <w:p>
+      <w:pPr>
+        <w:pStyle w:val="ResumeBody"/>
+        <w:spacing w:after="40"/>
+      </w:pPr>
+      <w:r>
+        <w:rPr>
+          <w:b/>
+          <w:color w:val="183F5C"/>
+        </w:rPr>
+        <w:t xml:space="preserve">Compatibility fix — </w:t>
+      </w:r>
+      <w:r>
+        <w:t xml:space="preserve">Directed and reviewed an AI-assisted fix so the OpenAI provider advertises sampling options only for models that accept them, with tests: </w:t>
+      </w:r>
+      <w:hyperlink r:id="rId17" w:history="1">
+        <w:r>
+          <w:rPr>
+            <w:color w:val="1B5B84"/>
+            <w:u w:val="single"/>
+          </w:rPr>
+          <w:t>WordPress/ai-provider-for-openai PR #40</w:t>
+        </w:r>
+      </w:hyperlink>
+      <w:r>
+        <w:t>, merged Aug 16, 2026.</w:t>
+      </w:r>
+    </w:p>
+    <w:p>
+      <w:pPr>
+        <w:pStyle w:val="ResumeBody"/>
+        <w:spacing w:after="40"/>
+      </w:pPr>
+      <w:r>
+        <w:rPr>
+          <w:b/>
+          <w:color w:val="183F5C"/>
+        </w:rPr>
+        <w:t xml:space="preserve">Input validation — </w:t>
+      </w:r>
+      <w:r>
+        <w:t xml:space="preserve">Directed and reviewed an AI-assisted contribution that rejects NAN and infinite embedding values, with a regression test for each: </w:t>
+      </w:r>
+      <w:hyperlink r:id="rId18" w:history="1">
+        <w:r>
+          <w:rPr>
+            <w:color w:val="1B5B84"/>
+            <w:u w:val="single"/>
+          </w:rPr>
+          <w:t>WordPress/php-ai-client PR #263</w:t>
+        </w:r>
+      </w:hyperlink>
+      <w:r>
+        <w:t>, open contribution.</w:t>
       </w:r>
     </w:p>
     <w:p>
@@ -227,210 +416,36 @@
         <w:pBdr>
           <w:bottom w:val="single" w:sz="5" w:space="1" w:color="9FB3C5"/>
         </w:pBdr>
+        <w:spacing w:before="120" w:after="40"/>
       </w:pPr>
       <w:r>
         <w:rPr>
           <w:b/>
           <w:color w:val="183F5C"/>
         </w:rPr>
-        <w:t>UPSTREAM WORDPRESS CONTRIBUTION RECORD</w:t>
+        <w:t>SELECTED PROJECTS</w:t>
       </w:r>
     </w:p>
     <w:p>
       <w:pPr>
         <w:pStyle w:val="ResumeBody"/>
-        <w:spacing w:after="12"/>
+        <w:spacing w:after="40"/>
       </w:pPr>
       <w:r>
-        <w:rPr>
-          <w:b/>
-          <w:color w:val="183F5C"/>
-        </w:rPr>
-        <w:t xml:space="preserve">MERGED — </w:t>
-      </w:r>
-      <w:hyperlink r:id="rId11" w:history="1">
-        <w:r>
-          <w:rPr>
-            <w:color w:val="1B5B84"/>
-            <w:szCs w:val="19"/>
-            <w:u w:val="single"/>
-          </w:rPr>
-          <w:t>WordPress/ai PR #501</w:t>
-        </w:r>
-      </w:hyperlink>
-      <w:r>
-        <w:t>: authored Content Resizing and Title Generation experiment documentation; merged May 18, 2026.</w:t>
-      </w:r>
-    </w:p>
-    <w:p>
-      <w:pPr>
-        <w:pStyle w:val="ResumeBody"/>
-        <w:spacing w:after="12"/>
-      </w:pPr>
-      <w:r>
-        <w:rPr>
-          <w:b/>
-          <w:color w:val="183F5C"/>
-        </w:rPr>
-        <w:t xml:space="preserve">OPEN UPSTREAM CODE — </w:t>
-      </w:r>
-      <w:hyperlink r:id="rId12" w:history="1">
-        <w:r>
-          <w:rPr>
-            <w:color w:val="1B5B84"/>
-            <w:szCs w:val="19"/>
-            <w:u w:val="single"/>
-          </w:rPr>
-          <w:t>WordPress/php-ai-client PR #263</w:t>
-        </w:r>
-      </w:hyperlink>
-      <w:r>
-        <w:t>: authored regression coverage and finite-vector validation rejecting NAN, INF, and -INF embedding values.</w:t>
-      </w:r>
-    </w:p>
-    <w:p>
-      <w:pPr>
-        <w:pStyle w:val="ResumeBody"/>
-        <w:spacing w:after="12"/>
-      </w:pPr>
-      <w:r>
-        <w:rPr>
-          <w:b/>
-          <w:color w:val="183F5C"/>
-        </w:rPr>
-        <w:t xml:space="preserve">OPEN UPSTREAM CODE — </w:t>
-      </w:r>
-      <w:hyperlink r:id="rId13" w:history="1">
-        <w:r>
-          <w:rPr>
-            <w:color w:val="1B5B84"/>
-            <w:szCs w:val="19"/>
-            <w:u w:val="single"/>
-          </w:rPr>
-          <w:t>WordPress/ai-provider-for-openai PR #40</w:t>
-        </w:r>
-      </w:hyperlink>
-      <w:r>
-        <w:t>: authored model-aware sampling compatibility metadata and tests for OpenAI reasoning models.</w:t>
-      </w:r>
-    </w:p>
-    <w:p>
-      <w:pPr>
-        <w:pStyle w:val="ResumeBody"/>
-        <w:spacing w:after="12"/>
-      </w:pPr>
-      <w:r>
-        <w:rPr>
-          <w:b/>
-          <w:color w:val="183F5C"/>
-        </w:rPr>
-        <w:t xml:space="preserve">REPORTED · FIX SHIPPED — </w:t>
-      </w:r>
-      <w:hyperlink r:id="rId14" w:history="1">
-        <w:r>
-          <w:rPr>
-            <w:color w:val="1B5B84"/>
-            <w:szCs w:val="19"/>
-            <w:u w:val="single"/>
-          </w:rPr>
-          <w:t>Issue #529</w:t>
-        </w:r>
-      </w:hyperlink>
-      <w:r>
-        <w:t xml:space="preserve">: reported and reproduced a Guidelines content-type defect; a maintainer authored </w:t>
-      </w:r>
-      <w:hyperlink r:id="rId15" w:history="1">
-        <w:r>
-          <w:rPr>
-            <w:color w:val="1B5B84"/>
-            <w:szCs w:val="19"/>
-            <w:u w:val="single"/>
-          </w:rPr>
-          <w:t>PR #593</w:t>
-        </w:r>
-      </w:hyperlink>
-      <w:r>
-        <w:t xml:space="preserve"> and </w:t>
-      </w:r>
-      <w:hyperlink r:id="rId16" w:history="1">
-        <w:r>
-          <w:rPr>
-            <w:color w:val="1B5B84"/>
-            <w:szCs w:val="19"/>
-            <w:u w:val="single"/>
-          </w:rPr>
-          <w:t>WordPress AI 1.0.1</w:t>
-        </w:r>
-      </w:hyperlink>
-      <w:r>
-        <w:t xml:space="preserve"> shipped it.</w:t>
-      </w:r>
-    </w:p>
-    <w:p>
-      <w:pPr>
-        <w:pStyle w:val="ResumeBody"/>
-        <w:spacing w:after="12"/>
-      </w:pPr>
-      <w:r>
-        <w:rPr>
-          <w:b/>
-          <w:color w:val="183F5C"/>
-        </w:rPr>
-        <w:t xml:space="preserve">REPORTED · INTEGRATION TESTED — </w:t>
-      </w:r>
-      <w:hyperlink r:id="rId17" w:history="1">
-        <w:r>
-          <w:rPr>
-            <w:color w:val="1B5B84"/>
-            <w:szCs w:val="19"/>
-            <w:u w:val="single"/>
-          </w:rPr>
-          <w:t>Issue #732</w:t>
-        </w:r>
-      </w:hyperlink>
-      <w:r>
-        <w:t xml:space="preserve">: authored the report and reproduction. Anubhav Anand authored </w:t>
-      </w:r>
-      <w:hyperlink r:id="rId18" w:history="1">
-        <w:r>
-          <w:rPr>
-            <w:color w:val="1B5B84"/>
-            <w:szCs w:val="19"/>
-            <w:u w:val="single"/>
-          </w:rPr>
-          <w:t>PR #757</w:t>
-        </w:r>
-      </w:hyperlink>
-      <w:r>
-        <w:t>; Henry tested lifecycle capture, found duplicate successes and missing failures, and proposed the ownership split.</w:t>
-      </w:r>
-    </w:p>
-    <w:p>
-      <w:pPr>
-        <w:pStyle w:val="Heading2"/>
-        <w:keepNext/>
-        <w:pBdr>
-          <w:bottom w:val="single" w:sz="5" w:space="1" w:color="9FB3C5"/>
-        </w:pBdr>
-      </w:pPr>
-      <w:r>
-        <w:rPr>
-          <w:b/>
-          <w:color w:val="183F5C"/>
-        </w:rPr>
-        <w:t>TECHNICAL PROOF</w:t>
+        <w:t>Solo projects, built AI-assisted under my direction and review, with public tagged releases.</w:t>
       </w:r>
     </w:p>
     <w:p>
       <w:pPr>
         <w:pStyle w:val="ResumeEntry"/>
         <w:keepNext/>
+        <w:spacing w:before="60" w:after="10"/>
       </w:pPr>
       <w:r>
         <w:rPr>
           <w:b/>
         </w:rPr>
-        <w:t>Flavor Agent — Author</w:t>
+        <w:t>Flavor Agent — Creator</w:t>
       </w:r>
       <w:r>
         <w:rPr>
@@ -442,39 +457,32 @@
     <w:p>
       <w:pPr>
         <w:pStyle w:val="ResumeBody"/>
-        <w:spacing w:after="12"/>
+        <w:spacing w:after="40"/>
       </w:pPr>
-      <w:r>
-        <w:rPr>
-          <w:b/>
-          <w:color w:val="183F5C"/>
-        </w:rPr>
-        <w:t xml:space="preserve">PRERELEASE + ACTIVE — </w:t>
-      </w:r>
       <w:hyperlink r:id="rId19" w:history="1">
         <w:r>
           <w:rPr>
             <w:color w:val="1B5B84"/>
-            <w:szCs w:val="19"/>
             <w:u w:val="single"/>
           </w:rPr>
-          <w:t>v0.1.0-rc.3</w:t>
+          <w:t>v0.1.0</w:t>
         </w:r>
       </w:hyperlink>
       <w:r>
-        <w:t xml:space="preserve"> is the latest public prerelease; post-RC3 main adds governed content/template apply and undo, schema hardening, and canonical target authorization; unreleased.</w:t>
+        <w:t xml:space="preserve"> released Aug 26, 2026: puts AI-proposed site changes through validation, admin approval, an audit record, and safe undo inside the block editor and wp-admin.</w:t>
       </w:r>
     </w:p>
     <w:p>
       <w:pPr>
         <w:pStyle w:val="ResumeEntry"/>
         <w:keepNext/>
+        <w:spacing w:before="60" w:after="10"/>
       </w:pPr>
       <w:r>
         <w:rPr>
           <w:b/>
         </w:rPr>
-        <w:t>AI Provider for Codex — Author</w:t>
+        <w:t>AI Provider for Codex — Creator</w:t>
       </w:r>
       <w:r>
         <w:rPr>
@@ -486,84 +494,68 @@
     <w:p>
       <w:pPr>
         <w:pStyle w:val="ResumeBody"/>
-        <w:spacing w:after="12"/>
+        <w:spacing w:after="40"/>
       </w:pPr>
-      <w:r>
-        <w:rPr>
-          <w:b/>
-          <w:color w:val="183F5C"/>
-        </w:rPr>
-        <w:t xml:space="preserve">RELEASED OWNED WORK — </w:t>
-      </w:r>
       <w:hyperlink r:id="rId20" w:history="1">
         <w:r>
           <w:rPr>
             <w:color w:val="1B5B84"/>
-            <w:szCs w:val="19"/>
             <w:u w:val="single"/>
           </w:rPr>
           <w:t>v2.1</w:t>
         </w:r>
       </w:hyperlink>
       <w:r>
-        <w:t>: WordPress AI Client provider for Codex text and capability-gated image generation with isolated per-user runtime state.</w:t>
+        <w:t xml:space="preserve"> released: connects Codex text and image generation to the WordPress AI Client through a local sidecar.</w:t>
       </w:r>
     </w:p>
     <w:p>
       <w:pPr>
         <w:pStyle w:val="ResumeEntry"/>
         <w:keepNext/>
+        <w:spacing w:before="60" w:after="10"/>
       </w:pPr>
       <w:r>
         <w:rPr>
           <w:b/>
         </w:rPr>
-        <w:t>HPerkins Tokens — Author</w:t>
+        <w:t>HPerkins Tokens — Creator</w:t>
       </w:r>
       <w:r>
         <w:rPr>
           <w:color w:val="525D6B"/>
         </w:rPr>
-        <w:t xml:space="preserve">  |  WordPress theme</w:t>
+        <w:t xml:space="preserve">  |  WordPress block theme behind hperkins.blog</w:t>
       </w:r>
     </w:p>
     <w:p>
       <w:pPr>
         <w:pStyle w:val="ResumeBody"/>
-        <w:spacing w:after="12"/>
+        <w:spacing w:after="40"/>
       </w:pPr>
-      <w:r>
-        <w:rPr>
-          <w:b/>
-          <w:color w:val="183F5C"/>
-        </w:rPr>
-        <w:t xml:space="preserve">RELEASED OWNED WORK — </w:t>
-      </w:r>
       <w:hyperlink r:id="rId21" w:history="1">
         <w:r>
           <w:rPr>
             <w:color w:val="1B5B84"/>
-            <w:szCs w:val="19"/>
             <w:u w:val="single"/>
           </w:rPr>
           <w:t>v0.3.53</w:t>
         </w:r>
       </w:hyperlink>
       <w:r>
-        <w:t xml:space="preserve"> · </w:t>
+        <w:t xml:space="preserve"> released · </w:t>
       </w:r>
       <w:hyperlink r:id="rId7" w:history="1">
         <w:r>
           <w:rPr>
             <w:color w:val="1B5B84"/>
-            <w:szCs w:val="19"/>
             <w:u w:val="single"/>
           </w:rPr>
           <w:t>hperkins.blog</w:t>
         </w:r>
       </w:hyperlink>
       <w:r>
-        <w:t>: token-governed block theme and accessible evidence system. Later commerce work is merged to main and unreleased.</w:t>
+        <w:t>: a token-governed block theme in which editors choose only named design tokens, guarded by verifier scripts for content, typography, and accessibility checks.</w:t>
       </w:r>
     </w:p>
     <w:p>
@@ -573,31 +565,55 @@
         <w:pBdr>
           <w:bottom w:val="single" w:sz="5" w:space="1" w:color="9FB3C5"/>
         </w:pBdr>
+        <w:spacing w:before="120" w:after="40"/>
       </w:pPr>
       <w:r>
         <w:rPr>
           <w:b/>
           <w:color w:val="183F5C"/>
         </w:rPr>
-        <w:t>SKILLS &amp; CAREER CONTEXT</w:t>
+        <w:t>TECHNICAL SKILLS &amp; ADDITIONAL EXPERIENCE</w:t>
       </w:r>
     </w:p>
     <w:p>
       <w:pPr>
         <w:pStyle w:val="ResumeBody"/>
-        <w:spacing w:after="12"/>
+        <w:spacing w:after="40"/>
       </w:pPr>
       <w:r>
-        <w:t>WordPress: PHP, JavaScript, Gutenberg, REST API, WP-CLI  ·  Support: HTTP, DNS, CSS cascade, browser debugging, escalation triage, customer communication  ·  Tooling: Git/GitHub, GitHub Actions, Plugin Check, PHPStan, Cloudflare Workers.</w:t>
+        <w:t>Code investigation and review: PHP, JavaScript, Gutenberg, REST API, WP-CLI · Support: HTTP, DNS, CSS, browser debugging, escalation triage · Tooling: Git/GitHub, GitHub Actions, Plugin Check, PHPStan, Cloudflare Workers.</w:t>
       </w:r>
     </w:p>
     <w:p>
       <w:pPr>
         <w:pStyle w:val="ResumeBody"/>
-        <w:spacing w:after="12"/>
+        <w:spacing w:after="40"/>
       </w:pPr>
       <w:r>
-        <w:t>Earlier customer and operations roles: Starbucks Shift Supervisor (2019–2022); Sodexo Starbucks Manager (2018–2019); Clinique Consultant (2015–2017); PageLines Developer Community Manager (2012); Micro Center Customer Service/Sales (2009–2012).</w:t>
+        <w:rPr>
+          <w:b/>
+          <w:color w:val="183F5C"/>
+        </w:rPr>
+        <w:t xml:space="preserve">Developer community — </w:t>
+      </w:r>
+      <w:r>
+        <w:t>PageLines Developer Community Manager (May–Oct 2012): onboarding content, tutorials, and day-to-day developer relations, turning community feedback into clearer product guidance.</w:t>
+      </w:r>
+    </w:p>
+    <w:p>
+      <w:pPr>
+        <w:pStyle w:val="ResumeBody"/>
+        <w:spacing w:after="40"/>
+      </w:pPr>
+      <w:r>
+        <w:rPr>
+          <w:b/>
+          <w:color w:val="183F5C"/>
+        </w:rPr>
+        <w:t xml:space="preserve">Customer and operations roles — </w:t>
+      </w:r>
+      <w:r>
+        <w:t>Starbucks Shift Supervisor (2019–2022); Sodexo Starbucks Manager (2018–2019); Clinique Consultant (2015–2017); Micro Center Customer Service/Sales (2009–2012).</w:t>
       </w:r>
     </w:p>
     <w:sectPr>
@@ -1209,7 +1225,7 @@
     <w:rPr>
       <w:rFonts w:ascii="Calibri" w:hAnsi="Calibri"/>
       <w:color w:val="1F2A37"/>
-      <w:sz w:val="19"/>
+      <w:sz w:val="21"/>
     </w:rPr>
   </w:style>
   <w:style w:type="paragraph" w:styleId="Heading1">
@@ -1245,7 +1261,7 @@
     <w:rsid w:val="00FC693F"/>
     <w:pPr>
       <w:keepNext/>
-      <w:spacing/>
+      <w:spacing w:before="120" w:after="40"/>
       <w:outlineLvl w:val="1"/>
     </w:pPr>
     <w:rPr>
@@ -1253,7 +1269,7 @@
       <w:b/>
       <w:bCs/>
       <w:color w:val="183F5C"/>
-      <w:sz w:val="19"/>
+      <w:sz w:val="21"/>
       <w:szCs w:val="26"/>
     </w:rPr>
   </w:style>
@@ -12225,7 +12241,7 @@
       <w:rFonts w:ascii="Calibri" w:hAnsi="Calibri"/>
       <w:b/>
       <w:color w:val="9A7530"/>
-      <w:sz w:val="17"/>
+      <w:sz w:val="18"/>
     </w:rPr>
   </w:style>
 </w:styles>

</xml_diff>

<commit_message>
Tighten resume project descriptions and attribution
Bound the Flavor Agent and HPerkins Tokens capability descriptions and
clarify independent-project AI assistance. Regenerate the matching DOCX
and tagged PDF while preserving the one-page layout and 10.5pt body size.
Update the copy contracts to enforce the approved wording.

Confirm PR #40 merged August 16, 2026; PRs #263 and #757 remain open.
Verify Flavor Agent v0.1.0 publication on August 26 and match the described
governance implementation in its release ZIP to tag commit 10c3a857.

Validation: 324 Node tests, 8 Python tests, 32 PHP lints, artifact checks
with live links, performance and Impeccable source checks, resume route
source, and diff check. PDF has matching text, 17 links, and heading tags;
PDFium and Poppler rendering inspected. Only three DOCX paragraphs changed.
</commit_message>
<xml_diff>
--- a/assets/documents/henry-perkins-wordpress-support-engineer-resume.docx
+++ b/assets/documents/henry-perkins-wordpress-support-engineer-resume.docx
@@ -432,7 +432,7 @@
         <w:spacing w:after="40"/>
       </w:pPr>
       <w:r>
-        <w:t>Solo projects, built AI-assisted under my direction and review, with public tagged releases.</w:t>
+        <w:t>Independent projects developed with AI assistance under my direction and review; public tagged releases.</w:t>
       </w:r>
     </w:p>
     <w:p>
@@ -469,7 +469,7 @@
         </w:r>
       </w:hyperlink>
       <w:r>
-        <w:t xml:space="preserve"> released Aug 26, 2026: puts AI-proposed site changes through validation, admin approval, an audit record, and safe undo inside the block editor and wp-admin.</w:t>
+        <w:t xml:space="preserve"> released Aug 26, 2026. Provides validation, admin approval, audit records, and undo workflows for supported AI-proposed WordPress changes.</w:t>
       </w:r>
     </w:p>
     <w:p>
@@ -555,7 +555,7 @@
         </w:r>
       </w:hyperlink>
       <w:r>
-        <w:t>: a token-governed block theme in which editors choose only named design tokens, guarded by verifier scripts for content, typography, and accessibility checks.</w:t>
+        <w:t>. WordPress block theme with token-based editor controls and verifier scripts for content, typography, and accessibility checks.</w:t>
       </w:r>
     </w:p>
     <w:p>

</xml_diff>